<commit_message>
added supplemental figure which is CWAK only Yukon PCA
</commit_message>
<xml_diff>
--- a/Docs/Supp. Machine learning applied to otolith timeseries data to discriminate river of origin for Western Alaska Salmon.docx
+++ b/Docs/Supp. Machine learning applied to otolith timeseries data to discriminate river of origin for Western Alaska Salmon.docx
@@ -7,6 +7,64 @@
         <w:rPr>
           <w:noProof/>
         </w:rPr>
+        <w:drawing>
+          <wp:inline distT="0" distB="0" distL="0" distR="0" wp14:anchorId="1A9E62D7" wp14:editId="0E5EA6D7">
+            <wp:extent cx="5943600" cy="4754880"/>
+            <wp:effectExtent l="0" t="0" r="0" b="0"/>
+            <wp:docPr id="570867597" name="Picture 1" descr="A diagram with colored circles and a red circle&#10;&#10;AI-generated content may be incorrect."/>
+            <wp:cNvGraphicFramePr>
+              <a:graphicFrameLocks xmlns:a="http://schemas.openxmlformats.org/drawingml/2006/main" noChangeAspect="1"/>
+            </wp:cNvGraphicFramePr>
+            <a:graphic xmlns:a="http://schemas.openxmlformats.org/drawingml/2006/main">
+              <a:graphicData uri="http://schemas.openxmlformats.org/drawingml/2006/picture">
+                <pic:pic xmlns:pic="http://schemas.openxmlformats.org/drawingml/2006/picture">
+                  <pic:nvPicPr>
+                    <pic:cNvPr id="570867597" name="Picture 1" descr="A diagram with colored circles and a red circle&#10;&#10;AI-generated content may be incorrect."/>
+                    <pic:cNvPicPr/>
+                  </pic:nvPicPr>
+                  <pic:blipFill>
+                    <a:blip r:embed="rId4" cstate="print">
+                      <a:extLst>
+                        <a:ext uri="{28A0092B-C50C-407E-A947-70E740481C1C}">
+                          <a14:useLocalDpi xmlns:a14="http://schemas.microsoft.com/office/drawing/2010/main" val="0"/>
+                        </a:ext>
+                      </a:extLst>
+                    </a:blip>
+                    <a:stretch>
+                      <a:fillRect/>
+                    </a:stretch>
+                  </pic:blipFill>
+                  <pic:spPr>
+                    <a:xfrm>
+                      <a:off x="0" y="0"/>
+                      <a:ext cx="5943600" cy="4754880"/>
+                    </a:xfrm>
+                    <a:prstGeom prst="rect">
+                      <a:avLst/>
+                    </a:prstGeom>
+                  </pic:spPr>
+                </pic:pic>
+              </a:graphicData>
+            </a:graphic>
+          </wp:inline>
+        </w:drawing>
+      </w:r>
+    </w:p>
+    <w:p>
+      <w:r>
+        <w:t xml:space="preserve">Supp Figure 1: </w:t>
+      </w:r>
+    </w:p>
+    <w:p/>
+    <w:p/>
+    <w:p/>
+    <w:p/>
+    <w:p>
+      <w:r>
+        <w:rPr>
+          <w:noProof/>
+        </w:rPr>
+        <w:lastRenderedPageBreak/>
         <w:drawing>
           <wp:inline distT="0" distB="0" distL="0" distR="0" wp14:anchorId="55EEEAA8" wp14:editId="2FF8E80C">
             <wp:extent cx="5943600" cy="2971800"/>
@@ -23,7 +81,7 @@
                     <pic:cNvPicPr/>
                   </pic:nvPicPr>
                   <pic:blipFill>
-                    <a:blip r:embed="rId4" cstate="print">
+                    <a:blip r:embed="rId5" cstate="print">
                       <a:extLst>
                         <a:ext uri="{28A0092B-C50C-407E-A947-70E740481C1C}">
                           <a14:useLocalDpi xmlns:a14="http://schemas.microsoft.com/office/drawing/2010/main" val="0"/>
@@ -55,7 +113,19 @@
         <w:rPr>
           <w:rStyle w:val="Strong"/>
         </w:rPr>
-        <w:t>Supplemental Figure 1:</w:t>
+        <w:t xml:space="preserve">Supplemental Figure </w:t>
+      </w:r>
+      <w:r>
+        <w:rPr>
+          <w:rStyle w:val="Strong"/>
+        </w:rPr>
+        <w:t>2</w:t>
+      </w:r>
+      <w:r>
+        <w:rPr>
+          <w:rStyle w:val="Strong"/>
+        </w:rPr>
+        <w:t>:</w:t>
       </w:r>
       <w:r>
         <w:rPr>
@@ -73,10 +143,7 @@
         <w:t xml:space="preserve"> within sliding windows</w:t>
       </w:r>
       <w:r>
-        <w:t xml:space="preserve"> for each watershed class</w:t>
-      </w:r>
-      <w:r>
-        <w:t xml:space="preserve">. Before calibration plots show that predicted probabilities deviate from expected 1:1 relationship. After isotonic calibration predictions much more closely align with observations. </w:t>
+        <w:t xml:space="preserve"> for each watershed class. Before calibration plots show that predicted probabilities deviate from expected 1:1 relationship. After isotonic calibration predictions much more closely align with observations. </w:t>
       </w:r>
     </w:p>
     <w:p/>

</xml_diff>

<commit_message>
updated caption in supp again
</commit_message>
<xml_diff>
--- a/Docs/Supp. Machine learning applied to otolith timeseries data to discriminate river of origin for Western Alaska Salmon.docx
+++ b/Docs/Supp. Machine learning applied to otolith timeseries data to discriminate river of origin for Western Alaska Salmon.docx
@@ -157,10 +157,12 @@
         <w:t xml:space="preserve"> within sliding windows</w:t>
       </w:r>
       <w:r>
-        <w:t xml:space="preserve"> for each watershed class. Before calibration plots show that predicted probabilities deviate from expected 1:1 relationship. After isotonic calibration predictions much more closely align with observations. </w:t>
+        <w:t xml:space="preserve"> for each watershed class. Before calibration plots show that predicted probabilities deviate from expected 1:1 relationship</w:t>
+      </w:r>
+      <w:r>
+        <w:t xml:space="preserve"> in some cases. Across all classes, this calibrated probabilities using isotonic calibration more closely align with observed event rates. </w:t>
       </w:r>
     </w:p>
-    <w:p/>
     <w:p/>
     <w:p>
       <w:r>

</xml_diff>